<commit_message>
ca11 Alabama district and bankruptcy templates: a doubled section sign or pilcrow ('§§ 157', '¶¶ 10') stays with its number on both engines in every folder of this set (typst boxes [§¶]{2,} with the number, the Word filter binds it with a no-break space; lib/ binds one sign only); re-rendered, check.sh typst and docx 0 failed, XENG-001..003 pass in all 12 folders (fb-595.68.10)
</commit_message>
<xml_diff>
--- a/courts/eleventh-circuit/alabama/federal/bankruptcy-northern-district/adversary-complaint/usage/OUTPUT-adversary-complaint.docx
+++ b/courts/eleventh-circuit/alabama/federal/bankruptcy-northern-district/adversary-complaint/usage/OUTPUT-adversary-complaint.docx
@@ -1115,7 +1115,7 @@
         <w:tab/>
       </w:r>
       <w:r>
-        <w:t xml:space="preserve">On or about December 21, 2020 (the “Filing Date”), the Debtor filed a voluntary petition for relief under Chapter 7 of title 11, United States Code, 11 U.S.C. §§ 101</w:t>
+        <w:t xml:space="preserve">On or about December 21, 2020 (the “Filing Date”), the Debtor filed a voluntary petition for relief under Chapter 7 of title 11, United States Code, 11 U.S.C. §§ 101</w:t>
       </w:r>
       <w:r>
         <w:noBreakHyphen/>
@@ -1189,7 +1189,7 @@
         <w:tab/>
       </w:r>
       <w:r>
-        <w:t xml:space="preserve">The Court has jurisdiction over this adversary proceeding pursuant to 28 U.S.C. §§ 157 and 1334(b).</w:t>
+        <w:t xml:space="preserve">The Court has jurisdiction over this adversary proceeding pursuant to 28 U.S.C. §§ 157 and 1334(b).</w:t>
       </w:r>
     </w:p>
     <w:p>

</xml_diff>